<commit_message>
publish student projects (Fall 2026) 2026-09-22 21:17
</commit_message>
<xml_diff>
--- a/Games/polterheist.docx
+++ b/Games/polterheist.docx
@@ -2166,7 +2166,34 @@
         <w:t xml:space="preserve"> </w:t>
       </w:r>
       <w:r>
-        <w:t xml:space="preserve">6 CS + 1 Design + 2 Art (9) — every block, room and enemy needs art in</w:t>
+        <w:t xml:space="preserve">6 CS + 1 Design + 1 Art (8) — a solo designer owns the perspective/gravity/possession puzzle design across the ≥5 stages and the block-interaction matrix; a single artist owns the environment/character art (rules: min 1 Design mandated, max 9 total, D+A ≤ 3; see</w:t>
+      </w:r>
+      <w:r>
+        <w:t xml:space="preserve"> </w:t>
+      </w:r>
+      <w:r>
+        <w:rPr>
+          <w:rStyle w:val="VerbatimChar"/>
+        </w:rPr>
+        <w:t xml:space="preserve">team-formation.pdf</w:t>
+      </w:r>
+      <w:r>
+        <w:t xml:space="preserve">).</w:t>
+      </w:r>
+      <w:r>
+        <w:t xml:space="preserve"> </w:t>
+      </w:r>
+      <w:r>
+        <w:rPr>
+          <w:b/>
+        </w:rPr>
+        <w:t xml:space="preserve">Art-load flag:</w:t>
+      </w:r>
+      <w:r>
+        <w:t xml:space="preserve"> </w:t>
+      </w:r>
+      <w:r>
+        <w:t xml:space="preserve">every block, room and enemy needs art in</w:t>
       </w:r>
       <w:r>
         <w:t xml:space="preserve"> </w:t>
@@ -2181,19 +2208,22 @@
         <w:t xml:space="preserve"> </w:t>
       </w:r>
       <w:r>
-        <w:t xml:space="preserve">projections (a side view and an isometric ¾ top-down view), so the environment/character art roughly doubles and earns 2 artists; a solo designer owns the perspective/gravity/possession puzzle design across the ≥5 stages and the block-interaction matrix (rules: min 1 Design mandated, max 9 total, D+A ≤ 3; see</w:t>
-      </w:r>
-      <w:r>
-        <w:t xml:space="preserve"> </w:t>
-      </w:r>
-      <w:r>
-        <w:rPr>
-          <w:rStyle w:val="VerbatimChar"/>
-        </w:rPr>
-        <w:t xml:space="preserve">team-formation.pdf</w:t>
-      </w:r>
-      <w:r>
-        <w:t xml:space="preserve">). If stage/puzzle volume outgrows one designer, trade the 2nd artist for a 2nd designer.</w:t>
+        <w:t xml:space="preserve">projections (a side view and an isometric ¾ top-down view), so the environment/character art roughly</w:t>
+      </w:r>
+      <w:r>
+        <w:t xml:space="preserve"> </w:t>
+      </w:r>
+      <w:r>
+        <w:rPr>
+          <w:b/>
+        </w:rPr>
+        <w:t xml:space="preserve">doubles</w:t>
+      </w:r>
+      <w:r>
+        <w:t xml:space="preserve"> </w:t>
+      </w:r>
+      <w:r>
+        <w:t xml:space="preserve">— a single artist is a real load risk. Scope the art hard (a tight tileset + minimal enemy/character set, both projections but few variants), or add a 2nd artist within D+A ≤ 3 if stage/asset volume grows.</w:t>
       </w:r>
       <w:r>
         <w:t xml:space="preserve"> </w:t>
@@ -2408,7 +2438,7 @@
         <w:t xml:space="preserve"> </w:t>
       </w:r>
       <w:r>
-        <w:t xml:space="preserve">2 artists justified (every asset in two projections + characters + enemies)</w:t>
+        <w:t xml:space="preserve">1 artist (dual-projection load — scope hard)</w:t>
       </w:r>
     </w:p>
     <w:p>
@@ -2445,42 +2475,6 @@
       </w:pPr>
       <w:r>
         <w:t xml:space="preserve">M1A3 Environment (the underworld tileset in BOTH side and iso ¾ top-down projections)</w:t>
-      </w:r>
-    </w:p>
-    <w:p>
-      <w:pPr>
-        <w:numPr>
-          <w:ilvl w:val="1"/>
-          <w:numId w:val="1022"/>
-        </w:numPr>
-        <w:pStyle w:val="Compact"/>
-      </w:pPr>
-      <w:r>
-        <w:t xml:space="preserve">M1A4 UI Art Concepts &amp; Typography (switch affordance, possession/detection HUD)</w:t>
-      </w:r>
-    </w:p>
-    <w:p>
-      <w:pPr>
-        <w:numPr>
-          <w:ilvl w:val="1"/>
-          <w:numId w:val="1022"/>
-        </w:numPr>
-        <w:pStyle w:val="Compact"/>
-      </w:pPr>
-      <w:r>
-        <w:t xml:space="preserve">M1A5 Animation Foundations (body move, spirit float, possession, enemy idle/alert)</w:t>
-      </w:r>
-    </w:p>
-    <w:p>
-      <w:pPr>
-        <w:numPr>
-          <w:ilvl w:val="1"/>
-          <w:numId w:val="1022"/>
-        </w:numPr>
-        <w:pStyle w:val="Compact"/>
-      </w:pPr>
-      <w:r>
-        <w:t xml:space="preserve">M1A6 Early Asset Production</w:t>
       </w:r>
     </w:p>
     <w:p>
@@ -2532,42 +2526,6 @@
       </w:pPr>
       <w:r>
         <w:t xml:space="preserve">M2A3 Environment Alive (both-projection ambient motion, block/room variety)</w:t>
-      </w:r>
-    </w:p>
-    <w:p>
-      <w:pPr>
-        <w:numPr>
-          <w:ilvl w:val="1"/>
-          <w:numId w:val="1023"/>
-        </w:numPr>
-        <w:pStyle w:val="Compact"/>
-      </w:pPr>
-      <w:r>
-        <w:t xml:space="preserve">M2A4 UI Art — States &amp; Feedback (detected, possessing, switch-locked, target reached)</w:t>
-      </w:r>
-    </w:p>
-    <w:p>
-      <w:pPr>
-        <w:numPr>
-          <w:ilvl w:val="1"/>
-          <w:numId w:val="1023"/>
-        </w:numPr>
-        <w:pStyle w:val="Compact"/>
-      </w:pPr>
-      <w:r>
-        <w:t xml:space="preserve">M2A5 VFX — Effects &amp; Transitions (the switch morph, possession glow, detection stingers)</w:t>
-      </w:r>
-    </w:p>
-    <w:p>
-      <w:pPr>
-        <w:numPr>
-          <w:ilvl w:val="1"/>
-          <w:numId w:val="1023"/>
-        </w:numPr>
-        <w:pStyle w:val="Compact"/>
-      </w:pPr>
-      <w:r>
-        <w:t xml:space="preserve">M2A6 Cutscenes &amp; Storyboards (heist intro / outro)</w:t>
       </w:r>
     </w:p>
     <w:p>

</xml_diff>